<commit_message>
multiple updates bad form
</commit_message>
<xml_diff>
--- a/Update SOP.docx
+++ b/Update SOP.docx
@@ -1,6 +1,6 @@
 
 <file path=word/document.xml><?xml version="1.0" encoding="utf-8"?>
-<w:document xmlns:wpc="http://schemas.microsoft.com/office/word/2010/wordprocessingCanvas" xmlns:cx="http://schemas.microsoft.com/office/drawing/2014/chartex" xmlns:cx1="http://schemas.microsoft.com/office/drawing/2015/9/8/chartex" xmlns:cx2="http://schemas.microsoft.com/office/drawing/2015/10/21/chartex" xmlns:cx3="http://schemas.microsoft.com/office/drawing/2016/5/9/chartex" xmlns:cx4="http://schemas.microsoft.com/office/drawing/2016/5/10/chartex" xmlns:cx5="http://schemas.microsoft.com/office/drawing/2016/5/11/chartex" xmlns:cx6="http://schemas.microsoft.com/office/drawing/2016/5/12/chartex" xmlns:cx7="http://schemas.microsoft.com/office/drawing/2016/5/13/chartex" xmlns:cx8="http://schemas.microsoft.com/office/drawing/2016/5/14/chartex" xmlns:mc="http://schemas.openxmlformats.org/markup-compatibility/2006" xmlns:aink="http://schemas.microsoft.com/office/drawing/2016/ink" xmlns:am3d="http://schemas.microsoft.com/office/drawing/2017/model3d" xmlns:o="urn:schemas-microsoft-com:office:office" xmlns:oel="http://schemas.microsoft.com/office/2019/extlst" xmlns:r="http://schemas.openxmlformats.org/officeDocument/2006/relationships" xmlns:m="http://schemas.openxmlformats.org/officeDocument/2006/math" xmlns:v="urn:schemas-microsoft-com:vml" xmlns:wp14="http://schemas.microsoft.com/office/word/2010/wordprocessingDrawing" xmlns:wp="http://schemas.openxmlformats.org/drawingml/2006/wordprocessingDrawing" xmlns:w10="urn:schemas-microsoft-com:office:word" xmlns:w="http://schemas.openxmlformats.org/wordprocessingml/2006/main" xmlns:w14="http://schemas.microsoft.com/office/word/2010/wordml" xmlns:w15="http://schemas.microsoft.com/office/word/2012/wordml" xmlns:w16cex="http://schemas.microsoft.com/office/word/2018/wordml/cex" xmlns:w16cid="http://schemas.microsoft.com/office/word/2016/wordml/cid" xmlns:w16="http://schemas.microsoft.com/office/word/2018/wordml" xmlns:w16sdtdh="http://schemas.microsoft.com/office/word/2020/wordml/sdtdatahash" xmlns:w16se="http://schemas.microsoft.com/office/word/2015/wordml/symex" xmlns:wpg="http://schemas.microsoft.com/office/word/2010/wordprocessingGroup" xmlns:wpi="http://schemas.microsoft.com/office/word/2010/wordprocessingInk" xmlns:wne="http://schemas.microsoft.com/office/word/2006/wordml" xmlns:wps="http://schemas.microsoft.com/office/word/2010/wordprocessingShape" mc:Ignorable="w14 w15 w16se w16cid w16 w16cex w16sdtdh wp14">
+<w:document xmlns:wpc="http://schemas.microsoft.com/office/word/2010/wordprocessingCanvas" xmlns:cx="http://schemas.microsoft.com/office/drawing/2014/chartex" xmlns:cx1="http://schemas.microsoft.com/office/drawing/2015/9/8/chartex" xmlns:cx2="http://schemas.microsoft.com/office/drawing/2015/10/21/chartex" xmlns:cx3="http://schemas.microsoft.com/office/drawing/2016/5/9/chartex" xmlns:cx4="http://schemas.microsoft.com/office/drawing/2016/5/10/chartex" xmlns:cx5="http://schemas.microsoft.com/office/drawing/2016/5/11/chartex" xmlns:cx6="http://schemas.microsoft.com/office/drawing/2016/5/12/chartex" xmlns:cx7="http://schemas.microsoft.com/office/drawing/2016/5/13/chartex" xmlns:cx8="http://schemas.microsoft.com/office/drawing/2016/5/14/chartex" xmlns:mc="http://schemas.openxmlformats.org/markup-compatibility/2006" xmlns:aink="http://schemas.microsoft.com/office/drawing/2016/ink" xmlns:am3d="http://schemas.microsoft.com/office/drawing/2017/model3d" xmlns:o="urn:schemas-microsoft-com:office:office" xmlns:oel="http://schemas.microsoft.com/office/2019/extlst" xmlns:r="http://schemas.openxmlformats.org/officeDocument/2006/relationships" xmlns:m="http://schemas.openxmlformats.org/officeDocument/2006/math" xmlns:v="urn:schemas-microsoft-com:vml" xmlns:wp14="http://schemas.microsoft.com/office/word/2010/wordprocessingDrawing" xmlns:wp="http://schemas.openxmlformats.org/drawingml/2006/wordprocessingDrawing" xmlns:w10="urn:schemas-microsoft-com:office:word" xmlns:w="http://schemas.openxmlformats.org/wordprocessingml/2006/main" xmlns:w14="http://schemas.microsoft.com/office/word/2010/wordml" xmlns:w15="http://schemas.microsoft.com/office/word/2012/wordml" xmlns:w16cex="http://schemas.microsoft.com/office/word/2018/wordml/cex" xmlns:w16cid="http://schemas.microsoft.com/office/word/2016/wordml/cid" xmlns:w16="http://schemas.microsoft.com/office/word/2018/wordml" xmlns:w16du="http://schemas.microsoft.com/office/word/2023/wordml/word16du" xmlns:w16sdtdh="http://schemas.microsoft.com/office/word/2020/wordml/sdtdatahash" xmlns:w16se="http://schemas.microsoft.com/office/word/2015/wordml/symex" xmlns:wpg="http://schemas.microsoft.com/office/word/2010/wordprocessingGroup" xmlns:wpi="http://schemas.microsoft.com/office/word/2010/wordprocessingInk" xmlns:wne="http://schemas.microsoft.com/office/word/2006/wordml" xmlns:wps="http://schemas.microsoft.com/office/word/2010/wordprocessingShape" mc:Ignorable="w14 w15 w16se w16cid w16 w16cex w16sdtdh w16du wp14">
   <w:body>
     <w:p>
       <w:r>
@@ -132,7 +132,13 @@
         </w:numPr>
       </w:pPr>
       <w:r>
-        <w:t>In the NCDR, open the combined metrics script (currently version 0_3_0) from op_benchmarking&gt;SQL</w:t>
+        <w:t xml:space="preserve">In the NCDR, open the combined metrics script (currently version </w:t>
+      </w:r>
+      <w:r>
+        <w:t>2_0</w:t>
+      </w:r>
+      <w:r>
+        <w:t>_0) from op_benchmarking&gt;SQL</w:t>
       </w:r>
     </w:p>
     <w:p>
@@ -307,7 +313,13 @@
         <w:t xml:space="preserve">waiting list script (at time of writing </w:t>
       </w:r>
       <w:r>
-        <w:t>it’s wl_values_2_0_0). This should open in SSMS</w:t>
+        <w:t>it’s wl_values_2_</w:t>
+      </w:r>
+      <w:r>
+        <w:t>1</w:t>
+      </w:r>
+      <w:r>
+        <w:t>_0). This should open in SSMS</w:t>
       </w:r>
       <w:r>
         <w:t xml:space="preserve"> if it doesn’t copy the script and paste it into a new query in SSMS.</w:t>
@@ -569,7 +581,6 @@
         </w:numPr>
       </w:pPr>
       <w:r>
-        <w:lastRenderedPageBreak/>
         <w:t xml:space="preserve">Once this is </w:t>
       </w:r>
       <w:r>
@@ -747,7 +758,7 @@
 </file>
 
 <file path=word/numbering.xml><?xml version="1.0" encoding="utf-8"?>
-<w:numbering xmlns:wpc="http://schemas.microsoft.com/office/word/2010/wordprocessingCanvas" xmlns:cx="http://schemas.microsoft.com/office/drawing/2014/chartex" xmlns:cx1="http://schemas.microsoft.com/office/drawing/2015/9/8/chartex" xmlns:cx2="http://schemas.microsoft.com/office/drawing/2015/10/21/chartex" xmlns:cx3="http://schemas.microsoft.com/office/drawing/2016/5/9/chartex" xmlns:cx4="http://schemas.microsoft.com/office/drawing/2016/5/10/chartex" xmlns:cx5="http://schemas.microsoft.com/office/drawing/2016/5/11/chartex" xmlns:cx6="http://schemas.microsoft.com/office/drawing/2016/5/12/chartex" xmlns:cx7="http://schemas.microsoft.com/office/drawing/2016/5/13/chartex" xmlns:cx8="http://schemas.microsoft.com/office/drawing/2016/5/14/chartex" xmlns:mc="http://schemas.openxmlformats.org/markup-compatibility/2006" xmlns:aink="http://schemas.microsoft.com/office/drawing/2016/ink" xmlns:am3d="http://schemas.microsoft.com/office/drawing/2017/model3d" xmlns:o="urn:schemas-microsoft-com:office:office" xmlns:oel="http://schemas.microsoft.com/office/2019/extlst" xmlns:r="http://schemas.openxmlformats.org/officeDocument/2006/relationships" xmlns:m="http://schemas.openxmlformats.org/officeDocument/2006/math" xmlns:v="urn:schemas-microsoft-com:vml" xmlns:wp14="http://schemas.microsoft.com/office/word/2010/wordprocessingDrawing" xmlns:wp="http://schemas.openxmlformats.org/drawingml/2006/wordprocessingDrawing" xmlns:w10="urn:schemas-microsoft-com:office:word" xmlns:w="http://schemas.openxmlformats.org/wordprocessingml/2006/main" xmlns:w14="http://schemas.microsoft.com/office/word/2010/wordml" xmlns:w15="http://schemas.microsoft.com/office/word/2012/wordml" xmlns:w16cex="http://schemas.microsoft.com/office/word/2018/wordml/cex" xmlns:w16cid="http://schemas.microsoft.com/office/word/2016/wordml/cid" xmlns:w16="http://schemas.microsoft.com/office/word/2018/wordml" xmlns:w16sdtdh="http://schemas.microsoft.com/office/word/2020/wordml/sdtdatahash" xmlns:w16se="http://schemas.microsoft.com/office/word/2015/wordml/symex" xmlns:wpg="http://schemas.microsoft.com/office/word/2010/wordprocessingGroup" xmlns:wpi="http://schemas.microsoft.com/office/word/2010/wordprocessingInk" xmlns:wne="http://schemas.microsoft.com/office/word/2006/wordml" xmlns:wps="http://schemas.microsoft.com/office/word/2010/wordprocessingShape" mc:Ignorable="w14 w15 w16se w16cid w16 w16cex w16sdtdh wp14">
+<w:numbering xmlns:wpc="http://schemas.microsoft.com/office/word/2010/wordprocessingCanvas" xmlns:cx="http://schemas.microsoft.com/office/drawing/2014/chartex" xmlns:cx1="http://schemas.microsoft.com/office/drawing/2015/9/8/chartex" xmlns:cx2="http://schemas.microsoft.com/office/drawing/2015/10/21/chartex" xmlns:cx3="http://schemas.microsoft.com/office/drawing/2016/5/9/chartex" xmlns:cx4="http://schemas.microsoft.com/office/drawing/2016/5/10/chartex" xmlns:cx5="http://schemas.microsoft.com/office/drawing/2016/5/11/chartex" xmlns:cx6="http://schemas.microsoft.com/office/drawing/2016/5/12/chartex" xmlns:cx7="http://schemas.microsoft.com/office/drawing/2016/5/13/chartex" xmlns:cx8="http://schemas.microsoft.com/office/drawing/2016/5/14/chartex" xmlns:mc="http://schemas.openxmlformats.org/markup-compatibility/2006" xmlns:aink="http://schemas.microsoft.com/office/drawing/2016/ink" xmlns:am3d="http://schemas.microsoft.com/office/drawing/2017/model3d" xmlns:o="urn:schemas-microsoft-com:office:office" xmlns:oel="http://schemas.microsoft.com/office/2019/extlst" xmlns:r="http://schemas.openxmlformats.org/officeDocument/2006/relationships" xmlns:m="http://schemas.openxmlformats.org/officeDocument/2006/math" xmlns:v="urn:schemas-microsoft-com:vml" xmlns:wp14="http://schemas.microsoft.com/office/word/2010/wordprocessingDrawing" xmlns:wp="http://schemas.openxmlformats.org/drawingml/2006/wordprocessingDrawing" xmlns:w10="urn:schemas-microsoft-com:office:word" xmlns:w="http://schemas.openxmlformats.org/wordprocessingml/2006/main" xmlns:w14="http://schemas.microsoft.com/office/word/2010/wordml" xmlns:w15="http://schemas.microsoft.com/office/word/2012/wordml" xmlns:w16cex="http://schemas.microsoft.com/office/word/2018/wordml/cex" xmlns:w16cid="http://schemas.microsoft.com/office/word/2016/wordml/cid" xmlns:w16="http://schemas.microsoft.com/office/word/2018/wordml" xmlns:w16du="http://schemas.microsoft.com/office/word/2023/wordml/word16du" xmlns:w16sdtdh="http://schemas.microsoft.com/office/word/2020/wordml/sdtdatahash" xmlns:w16se="http://schemas.microsoft.com/office/word/2015/wordml/symex" xmlns:wpg="http://schemas.microsoft.com/office/word/2010/wordprocessingGroup" xmlns:wpi="http://schemas.microsoft.com/office/word/2010/wordprocessingInk" xmlns:wne="http://schemas.microsoft.com/office/word/2006/wordml" xmlns:wps="http://schemas.microsoft.com/office/word/2010/wordprocessingShape" mc:Ignorable="w14 w15 w16se w16cid w16 w16cex w16sdtdh w16du wp14">
   <w:abstractNum w:abstractNumId="0" w15:restartNumberingAfterBreak="0">
     <w:nsid w:val="02B91686"/>
     <w:multiLevelType w:val="hybridMultilevel"/>
@@ -1049,7 +1060,7 @@
 </file>
 
 <file path=word/styles.xml><?xml version="1.0" encoding="utf-8"?>
-<w:styles xmlns:mc="http://schemas.openxmlformats.org/markup-compatibility/2006" xmlns:r="http://schemas.openxmlformats.org/officeDocument/2006/relationships" xmlns:w="http://schemas.openxmlformats.org/wordprocessingml/2006/main" xmlns:w14="http://schemas.microsoft.com/office/word/2010/wordml" xmlns:w15="http://schemas.microsoft.com/office/word/2012/wordml" xmlns:w16cex="http://schemas.microsoft.com/office/word/2018/wordml/cex" xmlns:w16cid="http://schemas.microsoft.com/office/word/2016/wordml/cid" xmlns:w16="http://schemas.microsoft.com/office/word/2018/wordml" xmlns:w16sdtdh="http://schemas.microsoft.com/office/word/2020/wordml/sdtdatahash" xmlns:w16se="http://schemas.microsoft.com/office/word/2015/wordml/symex" mc:Ignorable="w14 w15 w16se w16cid w16 w16cex w16sdtdh">
+<w:styles xmlns:mc="http://schemas.openxmlformats.org/markup-compatibility/2006" xmlns:r="http://schemas.openxmlformats.org/officeDocument/2006/relationships" xmlns:w="http://schemas.openxmlformats.org/wordprocessingml/2006/main" xmlns:w14="http://schemas.microsoft.com/office/word/2010/wordml" xmlns:w15="http://schemas.microsoft.com/office/word/2012/wordml" xmlns:w16cex="http://schemas.microsoft.com/office/word/2018/wordml/cex" xmlns:w16cid="http://schemas.microsoft.com/office/word/2016/wordml/cid" xmlns:w16="http://schemas.microsoft.com/office/word/2018/wordml" xmlns:w16du="http://schemas.microsoft.com/office/word/2023/wordml/word16du" xmlns:w16sdtdh="http://schemas.microsoft.com/office/word/2020/wordml/sdtdatahash" xmlns:w16se="http://schemas.microsoft.com/office/word/2015/wordml/symex" mc:Ignorable="w14 w15 w16se w16cid w16 w16cex w16sdtdh w16du">
   <w:docDefaults>
     <w:rPrDefault>
       <w:rPr>
@@ -1810,27 +1821,6 @@
 </file>
 
 <file path=customXml/item1.xml><?xml version="1.0" encoding="utf-8"?>
-<p:properties xmlns:p="http://schemas.microsoft.com/office/2006/metadata/properties" xmlns:xsi="http://www.w3.org/2001/XMLSchema-instance" xmlns:pc="http://schemas.microsoft.com/office/infopath/2007/PartnerControls">
-  <documentManagement>
-    <_ip_UnifiedCompliancePolicyUIAction xmlns="http://schemas.microsoft.com/sharepoint/v3" xsi:nil="true"/>
-    <Person xmlns="7ac25642-bc50-40b5-aee4-3aad54522c8e">
-      <UserInfo>
-        <DisplayName/>
-        <AccountId xsi:nil="true"/>
-        <AccountType/>
-      </UserInfo>
-    </Person>
-    <Review_x0020_Date xmlns="7ac25642-bc50-40b5-aee4-3aad54522c8e" xsi:nil="true"/>
-    <_ip_UnifiedCompliancePolicyProperties xmlns="http://schemas.microsoft.com/sharepoint/v3" xsi:nil="true"/>
-    <lcf76f155ced4ddcb4097134ff3c332f xmlns="7ac25642-bc50-40b5-aee4-3aad54522c8e">
-      <Terms xmlns="http://schemas.microsoft.com/office/infopath/2007/PartnerControls"/>
-    </lcf76f155ced4ddcb4097134ff3c332f>
-    <TaxCatchAll xmlns="cccaf3ac-2de9-44d4-aa31-54302fceb5f7" xsi:nil="true"/>
-  </documentManagement>
-</p:properties>
-</file>
-
-<file path=customXml/item2.xml><?xml version="1.0" encoding="utf-8"?>
 <?mso-contentType ?>
 <FormTemplates xmlns="http://schemas.microsoft.com/sharepoint/v3/contenttype/forms">
   <Display>DocumentLibraryForm</Display>
@@ -1839,32 +1829,45 @@
 </FormTemplates>
 </file>
 
+<file path=customXml/item2.xml><?xml version="1.0" encoding="utf-8"?>
+<p:properties xmlns:p="http://schemas.microsoft.com/office/2006/metadata/properties" xmlns:xsi="http://www.w3.org/2001/XMLSchema-instance" xmlns:pc="http://schemas.microsoft.com/office/infopath/2007/PartnerControls">
+  <documentManagement>
+    <MediaLengthInSeconds xmlns="5e67cd05-db79-4376-acf2-fd97aaab4b32" xsi:nil="true"/>
+    <_ip_UnifiedCompliancePolicyUIAction xmlns="http://schemas.microsoft.com/sharepoint/v3" xsi:nil="true"/>
+    <_ip_UnifiedCompliancePolicyProperties xmlns="http://schemas.microsoft.com/sharepoint/v3" xsi:nil="true"/>
+    <lcf76f155ced4ddcb4097134ff3c332f xmlns="5e67cd05-db79-4376-acf2-fd97aaab4b32">
+      <Terms xmlns="http://schemas.microsoft.com/office/infopath/2007/PartnerControls"/>
+    </lcf76f155ced4ddcb4097134ff3c332f>
+  </documentManagement>
+</p:properties>
+</file>
+
 <file path=customXml/item3.xml><?xml version="1.0" encoding="utf-8"?>
-<ct:contentTypeSchema xmlns:ct="http://schemas.microsoft.com/office/2006/metadata/contentType" xmlns:ma="http://schemas.microsoft.com/office/2006/metadata/properties/metaAttributes" ct:_="" ma:_="" ma:contentTypeName="Document" ma:contentTypeID="0x0101007B3BB9CF23C28F40815860AD19EBF8D8" ma:contentTypeVersion="69" ma:contentTypeDescription="Create a new document." ma:contentTypeScope="" ma:versionID="c27dc56a182141f0a236d562ca3d8131">
-  <xsd:schema xmlns:xsd="http://www.w3.org/2001/XMLSchema" xmlns:xs="http://www.w3.org/2001/XMLSchema" xmlns:p="http://schemas.microsoft.com/office/2006/metadata/properties" xmlns:ns1="http://schemas.microsoft.com/sharepoint/v3" xmlns:ns2="22284d95-5a94-4052-8e65-be8da71d5f72" xmlns:ns3="7ac25642-bc50-40b5-aee4-3aad54522c8e" xmlns:ns4="51bfcd92-eb3e-40f4-8778-2bbfb88a890b" xmlns:ns5="cccaf3ac-2de9-44d4-aa31-54302fceb5f7" targetNamespace="http://schemas.microsoft.com/office/2006/metadata/properties" ma:root="true" ma:fieldsID="404f797f4b8bf9f41e2eaefa8a1e7b93" ns1:_="" ns2:_="" ns3:_="" ns4:_="" ns5:_="">
+<ct:contentTypeSchema xmlns:ct="http://schemas.microsoft.com/office/2006/metadata/contentType" xmlns:ma="http://schemas.microsoft.com/office/2006/metadata/properties/metaAttributes" ct:_="" ma:_="" ma:contentTypeName="Document" ma:contentTypeID="0x01010073D7AEB253D84D40AB028D03AF2072F9" ma:contentTypeVersion="15" ma:contentTypeDescription="Create a new document." ma:contentTypeScope="" ma:versionID="21686548ca970890d60eb28dd514eff8">
+  <xsd:schema xmlns:xsd="http://www.w3.org/2001/XMLSchema" xmlns:xs="http://www.w3.org/2001/XMLSchema" xmlns:p="http://schemas.microsoft.com/office/2006/metadata/properties" xmlns:ns1="http://schemas.microsoft.com/sharepoint/v3" xmlns:ns2="5e67cd05-db79-4376-acf2-fd97aaab4b32" xmlns:ns3="19ad61a0-b527-4b3d-990a-302b4323a1c4" targetNamespace="http://schemas.microsoft.com/office/2006/metadata/properties" ma:root="true" ma:fieldsID="788261d9dd6ced231fb3cb851d967988" ns1:_="" ns2:_="" ns3:_="">
     <xsd:import namespace="http://schemas.microsoft.com/sharepoint/v3"/>
-    <xsd:import namespace="22284d95-5a94-4052-8e65-be8da71d5f72"/>
-    <xsd:import namespace="7ac25642-bc50-40b5-aee4-3aad54522c8e"/>
-    <xsd:import namespace="51bfcd92-eb3e-40f4-8778-2bbfb88a890b"/>
-    <xsd:import namespace="cccaf3ac-2de9-44d4-aa31-54302fceb5f7"/>
+    <xsd:import namespace="5e67cd05-db79-4376-acf2-fd97aaab4b32"/>
+    <xsd:import namespace="19ad61a0-b527-4b3d-990a-302b4323a1c4"/>
     <xsd:element name="properties">
       <xsd:complexType>
         <xsd:sequence>
           <xsd:element name="documentManagement">
             <xsd:complexType>
               <xsd:all>
-                <xsd:element ref="ns2:SharedWithUsers" minOccurs="0"/>
-                <xsd:element ref="ns2:SharedWithDetails" minOccurs="0"/>
+                <xsd:element ref="ns2:MediaServiceMetadata" minOccurs="0"/>
+                <xsd:element ref="ns2:MediaServiceFastMetadata" minOccurs="0"/>
+                <xsd:element ref="ns2:MediaServiceSearchProperties" minOccurs="0"/>
+                <xsd:element ref="ns2:MediaServiceDateTaken" minOccurs="0"/>
+                <xsd:element ref="ns2:MediaServiceObjectDetectorVersions" minOccurs="0"/>
+                <xsd:element ref="ns2:MediaServiceGenerationTime" minOccurs="0"/>
+                <xsd:element ref="ns2:MediaServiceEventHashCode" minOccurs="0"/>
+                <xsd:element ref="ns2:MediaLengthInSeconds" minOccurs="0"/>
                 <xsd:element ref="ns1:_ip_UnifiedCompliancePolicyProperties" minOccurs="0"/>
                 <xsd:element ref="ns1:_ip_UnifiedCompliancePolicyUIAction" minOccurs="0"/>
-                <xsd:element ref="ns3:MediaLengthInSeconds" minOccurs="0"/>
-                <xsd:element ref="ns4:SharedWithUsers" minOccurs="0"/>
-                <xsd:element ref="ns4:SharedWithDetails" minOccurs="0"/>
-                <xsd:element ref="ns3:Review_x0020_Date" minOccurs="0"/>
-                <xsd:element ref="ns3:lcf76f155ced4ddcb4097134ff3c332f" minOccurs="0"/>
-                <xsd:element ref="ns5:TaxCatchAll" minOccurs="0"/>
-                <xsd:element ref="ns3:Person" minOccurs="0"/>
-                <xsd:element ref="ns3:MediaServiceObjectDetectorVersions" minOccurs="0"/>
+                <xsd:element ref="ns2:lcf76f155ced4ddcb4097134ff3c332f" minOccurs="0"/>
+                <xsd:element ref="ns2:MediaServiceOCR" minOccurs="0"/>
+                <xsd:element ref="ns3:SharedWithUsers" minOccurs="0"/>
+                <xsd:element ref="ns3:SharedWithDetails" minOccurs="0"/>
               </xsd:all>
             </xsd:complexType>
           </xsd:element>
@@ -1875,21 +1878,79 @@
   <xsd:schema xmlns:xsd="http://www.w3.org/2001/XMLSchema" xmlns:xs="http://www.w3.org/2001/XMLSchema" xmlns:dms="http://schemas.microsoft.com/office/2006/documentManagement/types" xmlns:pc="http://schemas.microsoft.com/office/infopath/2007/PartnerControls" targetNamespace="http://schemas.microsoft.com/sharepoint/v3" elementFormDefault="qualified">
     <xsd:import namespace="http://schemas.microsoft.com/office/2006/documentManagement/types"/>
     <xsd:import namespace="http://schemas.microsoft.com/office/infopath/2007/PartnerControls"/>
-    <xsd:element name="_ip_UnifiedCompliancePolicyProperties" ma:index="10" nillable="true" ma:displayName="Unified Compliance Policy Properties" ma:hidden="true" ma:internalName="_ip_UnifiedCompliancePolicyProperties">
+    <xsd:element name="_ip_UnifiedCompliancePolicyProperties" ma:index="16" nillable="true" ma:displayName="Unified Compliance Policy Properties" ma:hidden="true" ma:internalName="_ip_UnifiedCompliancePolicyProperties">
       <xsd:simpleType>
         <xsd:restriction base="dms:Note"/>
       </xsd:simpleType>
     </xsd:element>
-    <xsd:element name="_ip_UnifiedCompliancePolicyUIAction" ma:index="11" nillable="true" ma:displayName="Unified Compliance Policy UI Action" ma:hidden="true" ma:internalName="_ip_UnifiedCompliancePolicyUIAction">
+    <xsd:element name="_ip_UnifiedCompliancePolicyUIAction" ma:index="17" nillable="true" ma:displayName="Unified Compliance Policy UI Action" ma:hidden="true" ma:internalName="_ip_UnifiedCompliancePolicyUIAction">
       <xsd:simpleType>
         <xsd:restriction base="dms:Text"/>
       </xsd:simpleType>
     </xsd:element>
   </xsd:schema>
-  <xsd:schema xmlns:xsd="http://www.w3.org/2001/XMLSchema" xmlns:xs="http://www.w3.org/2001/XMLSchema" xmlns:dms="http://schemas.microsoft.com/office/2006/documentManagement/types" xmlns:pc="http://schemas.microsoft.com/office/infopath/2007/PartnerControls" targetNamespace="22284d95-5a94-4052-8e65-be8da71d5f72" elementFormDefault="qualified">
+  <xsd:schema xmlns:xsd="http://www.w3.org/2001/XMLSchema" xmlns:xs="http://www.w3.org/2001/XMLSchema" xmlns:dms="http://schemas.microsoft.com/office/2006/documentManagement/types" xmlns:pc="http://schemas.microsoft.com/office/infopath/2007/PartnerControls" targetNamespace="5e67cd05-db79-4376-acf2-fd97aaab4b32" elementFormDefault="qualified">
     <xsd:import namespace="http://schemas.microsoft.com/office/2006/documentManagement/types"/>
     <xsd:import namespace="http://schemas.microsoft.com/office/infopath/2007/PartnerControls"/>
-    <xsd:element name="SharedWithUsers" ma:index="8" nillable="true" ma:displayName="Shared With" ma:description="" ma:internalName="SharedWithUsers" ma:readOnly="true">
+    <xsd:element name="MediaServiceMetadata" ma:index="8" nillable="true" ma:displayName="MediaServiceMetadata" ma:hidden="true" ma:internalName="MediaServiceMetadata" ma:readOnly="true">
+      <xsd:simpleType>
+        <xsd:restriction base="dms:Note"/>
+      </xsd:simpleType>
+    </xsd:element>
+    <xsd:element name="MediaServiceFastMetadata" ma:index="9" nillable="true" ma:displayName="MediaServiceFastMetadata" ma:hidden="true" ma:internalName="MediaServiceFastMetadata" ma:readOnly="true">
+      <xsd:simpleType>
+        <xsd:restriction base="dms:Note"/>
+      </xsd:simpleType>
+    </xsd:element>
+    <xsd:element name="MediaServiceSearchProperties" ma:index="10" nillable="true" ma:displayName="MediaServiceSearchProperties" ma:hidden="true" ma:internalName="MediaServiceSearchProperties" ma:readOnly="true">
+      <xsd:simpleType>
+        <xsd:restriction base="dms:Note"/>
+      </xsd:simpleType>
+    </xsd:element>
+    <xsd:element name="MediaServiceDateTaken" ma:index="11" nillable="true" ma:displayName="MediaServiceDateTaken" ma:hidden="true" ma:indexed="true" ma:internalName="MediaServiceDateTaken" ma:readOnly="true">
+      <xsd:simpleType>
+        <xsd:restriction base="dms:Text"/>
+      </xsd:simpleType>
+    </xsd:element>
+    <xsd:element name="MediaServiceObjectDetectorVersions" ma:index="12" nillable="true" ma:displayName="MediaServiceObjectDetectorVersions" ma:hidden="true" ma:indexed="true" ma:internalName="MediaServiceObjectDetectorVersions" ma:readOnly="true">
+      <xsd:simpleType>
+        <xsd:restriction base="dms:Text"/>
+      </xsd:simpleType>
+    </xsd:element>
+    <xsd:element name="MediaServiceGenerationTime" ma:index="13" nillable="true" ma:displayName="MediaServiceGenerationTime" ma:hidden="true" ma:internalName="MediaServiceGenerationTime" ma:readOnly="true">
+      <xsd:simpleType>
+        <xsd:restriction base="dms:Text"/>
+      </xsd:simpleType>
+    </xsd:element>
+    <xsd:element name="MediaServiceEventHashCode" ma:index="14" nillable="true" ma:displayName="MediaServiceEventHashCode" ma:hidden="true" ma:internalName="MediaServiceEventHashCode" ma:readOnly="true">
+      <xsd:simpleType>
+        <xsd:restriction base="dms:Text"/>
+      </xsd:simpleType>
+    </xsd:element>
+    <xsd:element name="MediaLengthInSeconds" ma:index="15" nillable="true" ma:displayName="MediaLengthInSeconds" ma:hidden="true" ma:internalName="MediaLengthInSeconds" ma:readOnly="true">
+      <xsd:simpleType>
+        <xsd:restriction base="dms:Unknown"/>
+      </xsd:simpleType>
+    </xsd:element>
+    <xsd:element name="lcf76f155ced4ddcb4097134ff3c332f" ma:index="19" nillable="true" ma:taxonomy="true" ma:internalName="lcf76f155ced4ddcb4097134ff3c332f" ma:taxonomyFieldName="MediaServiceImageTags" ma:displayName="Image Tags" ma:readOnly="false" ma:fieldId="{5cf76f15-5ced-4ddc-b409-7134ff3c332f}" ma:taxonomyMulti="true" ma:sspId="2c8d5fda-b97d-42c6-97e2-f76465e161c0" ma:termSetId="09814cd3-568e-fe90-9814-8d621ff8fb84" ma:anchorId="fba54fb3-c3e1-fe81-a776-ca4b69148c4d" ma:open="true" ma:isKeyword="false">
+      <xsd:complexType>
+        <xsd:sequence>
+          <xsd:element ref="pc:Terms" minOccurs="0" maxOccurs="1"/>
+        </xsd:sequence>
+      </xsd:complexType>
+    </xsd:element>
+    <xsd:element name="MediaServiceOCR" ma:index="20" nillable="true" ma:displayName="Extracted Text" ma:internalName="MediaServiceOCR" ma:readOnly="true">
+      <xsd:simpleType>
+        <xsd:restriction base="dms:Note">
+          <xsd:maxLength value="255"/>
+        </xsd:restriction>
+      </xsd:simpleType>
+    </xsd:element>
+  </xsd:schema>
+  <xsd:schema xmlns:xsd="http://www.w3.org/2001/XMLSchema" xmlns:xs="http://www.w3.org/2001/XMLSchema" xmlns:dms="http://schemas.microsoft.com/office/2006/documentManagement/types" xmlns:pc="http://schemas.microsoft.com/office/infopath/2007/PartnerControls" targetNamespace="19ad61a0-b527-4b3d-990a-302b4323a1c4" elementFormDefault="qualified">
+    <xsd:import namespace="http://schemas.microsoft.com/office/2006/documentManagement/types"/>
+    <xsd:import namespace="http://schemas.microsoft.com/office/infopath/2007/PartnerControls"/>
+    <xsd:element name="SharedWithUsers" ma:index="21" nillable="true" ma:displayName="Shared With" ma:internalName="SharedWithUsers" ma:readOnly="true">
       <xsd:complexType>
         <xsd:complexContent>
           <xsd:extension base="dms:UserMulti">
@@ -1908,102 +1969,12 @@
         </xsd:complexContent>
       </xsd:complexType>
     </xsd:element>
-    <xsd:element name="SharedWithDetails" ma:index="9" nillable="true" ma:displayName="Shared With Details" ma:internalName="SharedWithDetails" ma:readOnly="true">
+    <xsd:element name="SharedWithDetails" ma:index="22" nillable="true" ma:displayName="Shared With Details" ma:internalName="SharedWithDetails" ma:readOnly="true">
       <xsd:simpleType>
         <xsd:restriction base="dms:Note">
           <xsd:maxLength value="255"/>
         </xsd:restriction>
       </xsd:simpleType>
-    </xsd:element>
-  </xsd:schema>
-  <xsd:schema xmlns:xsd="http://www.w3.org/2001/XMLSchema" xmlns:xs="http://www.w3.org/2001/XMLSchema" xmlns:dms="http://schemas.microsoft.com/office/2006/documentManagement/types" xmlns:pc="http://schemas.microsoft.com/office/infopath/2007/PartnerControls" targetNamespace="7ac25642-bc50-40b5-aee4-3aad54522c8e" elementFormDefault="qualified">
-    <xsd:import namespace="http://schemas.microsoft.com/office/2006/documentManagement/types"/>
-    <xsd:import namespace="http://schemas.microsoft.com/office/infopath/2007/PartnerControls"/>
-    <xsd:element name="MediaLengthInSeconds" ma:index="12" nillable="true" ma:displayName="Length (seconds)" ma:internalName="MediaLengthInSeconds" ma:readOnly="true">
-      <xsd:simpleType>
-        <xsd:restriction base="dms:Unknown"/>
-      </xsd:simpleType>
-    </xsd:element>
-    <xsd:element name="Review_x0020_Date" ma:index="15" nillable="true" ma:displayName="Review date" ma:indexed="true" ma:internalName="Review_x0020_Date">
-      <xsd:simpleType>
-        <xsd:restriction base="dms:Text"/>
-      </xsd:simpleType>
-    </xsd:element>
-    <xsd:element name="lcf76f155ced4ddcb4097134ff3c332f" ma:index="17" nillable="true" ma:taxonomy="true" ma:internalName="lcf76f155ced4ddcb4097134ff3c332f" ma:taxonomyFieldName="MediaServiceImageTags" ma:displayName="Image Tags" ma:readOnly="false" ma:fieldId="{5cf76f15-5ced-4ddc-b409-7134ff3c332f}" ma:taxonomyMulti="true" ma:sspId="443b0bdb-28a8-4814-9fb9-624c17c095fc" ma:termSetId="09814cd3-568e-fe90-9814-8d621ff8fb84" ma:anchorId="fba54fb3-c3e1-fe81-a776-ca4b69148c4d" ma:open="true" ma:isKeyword="false">
-      <xsd:complexType>
-        <xsd:sequence>
-          <xsd:element ref="pc:Terms" minOccurs="0" maxOccurs="1"/>
-        </xsd:sequence>
-      </xsd:complexType>
-    </xsd:element>
-    <xsd:element name="Person" ma:index="19" nillable="true" ma:displayName="Person" ma:format="Dropdown" ma:list="UserInfo" ma:SharePointGroup="0" ma:internalName="Person">
-      <xsd:complexType>
-        <xsd:complexContent>
-          <xsd:extension base="dms:User">
-            <xsd:sequence>
-              <xsd:element name="UserInfo" minOccurs="0" maxOccurs="unbounded">
-                <xsd:complexType>
-                  <xsd:sequence>
-                    <xsd:element name="DisplayName" type="xsd:string" minOccurs="0"/>
-                    <xsd:element name="AccountId" type="dms:UserId" minOccurs="0" nillable="true"/>
-                    <xsd:element name="AccountType" type="xsd:string" minOccurs="0"/>
-                  </xsd:sequence>
-                </xsd:complexType>
-              </xsd:element>
-            </xsd:sequence>
-          </xsd:extension>
-        </xsd:complexContent>
-      </xsd:complexType>
-    </xsd:element>
-    <xsd:element name="MediaServiceObjectDetectorVersions" ma:index="20" nillable="true" ma:displayName="MediaServiceObjectDetectorVersions" ma:description="" ma:hidden="true" ma:indexed="true" ma:internalName="MediaServiceObjectDetectorVersions" ma:readOnly="true">
-      <xsd:simpleType>
-        <xsd:restriction base="dms:Text"/>
-      </xsd:simpleType>
-    </xsd:element>
-  </xsd:schema>
-  <xsd:schema xmlns:xsd="http://www.w3.org/2001/XMLSchema" xmlns:xs="http://www.w3.org/2001/XMLSchema" xmlns:dms="http://schemas.microsoft.com/office/2006/documentManagement/types" xmlns:pc="http://schemas.microsoft.com/office/infopath/2007/PartnerControls" targetNamespace="51bfcd92-eb3e-40f4-8778-2bbfb88a890b" elementFormDefault="qualified">
-    <xsd:import namespace="http://schemas.microsoft.com/office/2006/documentManagement/types"/>
-    <xsd:import namespace="http://schemas.microsoft.com/office/infopath/2007/PartnerControls"/>
-    <xsd:element name="SharedWithUsers" ma:index="13" nillable="true" ma:displayName="Shared With" ma:internalName="SharedWithUsers0" ma:readOnly="true">
-      <xsd:complexType>
-        <xsd:complexContent>
-          <xsd:extension base="dms:UserMulti">
-            <xsd:sequence>
-              <xsd:element name="UserInfo" minOccurs="0" maxOccurs="unbounded">
-                <xsd:complexType>
-                  <xsd:sequence>
-                    <xsd:element name="DisplayName" type="xsd:string" minOccurs="0"/>
-                    <xsd:element name="AccountId" type="dms:UserId" minOccurs="0" nillable="true"/>
-                    <xsd:element name="AccountType" type="xsd:string" minOccurs="0"/>
-                  </xsd:sequence>
-                </xsd:complexType>
-              </xsd:element>
-            </xsd:sequence>
-          </xsd:extension>
-        </xsd:complexContent>
-      </xsd:complexType>
-    </xsd:element>
-    <xsd:element name="SharedWithDetails" ma:index="14" nillable="true" ma:displayName="Shared With Details" ma:internalName="SharedWithDetails0" ma:readOnly="true">
-      <xsd:simpleType>
-        <xsd:restriction base="dms:Note">
-          <xsd:maxLength value="255"/>
-        </xsd:restriction>
-      </xsd:simpleType>
-    </xsd:element>
-  </xsd:schema>
-  <xsd:schema xmlns:xsd="http://www.w3.org/2001/XMLSchema" xmlns:xs="http://www.w3.org/2001/XMLSchema" xmlns:dms="http://schemas.microsoft.com/office/2006/documentManagement/types" xmlns:pc="http://schemas.microsoft.com/office/infopath/2007/PartnerControls" targetNamespace="cccaf3ac-2de9-44d4-aa31-54302fceb5f7" elementFormDefault="qualified">
-    <xsd:import namespace="http://schemas.microsoft.com/office/2006/documentManagement/types"/>
-    <xsd:import namespace="http://schemas.microsoft.com/office/infopath/2007/PartnerControls"/>
-    <xsd:element name="TaxCatchAll" ma:index="18" nillable="true" ma:displayName="Taxonomy Catch All Column" ma:hidden="true" ma:list="{1dfd61aa-f1bb-422b-ba48-68343f7c84c9}" ma:internalName="TaxCatchAll" ma:showField="CatchAllData" ma:web="51bfcd92-eb3e-40f4-8778-2bbfb88a890b">
-      <xsd:complexType>
-        <xsd:complexContent>
-          <xsd:extension base="dms:MultiChoiceLookup">
-            <xsd:sequence>
-              <xsd:element name="Value" type="dms:Lookup" maxOccurs="unbounded" minOccurs="0" nillable="true"/>
-            </xsd:sequence>
-          </xsd:extension>
-        </xsd:complexContent>
-      </xsd:complexType>
     </xsd:element>
   </xsd:schema>
   <xsd:schema xmlns="http://schemas.openxmlformats.org/package/2006/metadata/core-properties" xmlns:xsd="http://www.w3.org/2001/XMLSchema" xmlns:xsi="http://www.w3.org/2001/XMLSchema-instance" xmlns:dc="http://purl.org/dc/elements/1.1/" xmlns:dcterms="http://purl.org/dc/terms/" xmlns:odoc="http://schemas.microsoft.com/internal/obd" targetNamespace="http://schemas.openxmlformats.org/package/2006/metadata/core-properties" elementFormDefault="qualified" attributeFormDefault="unqualified" blockDefault="#all">
@@ -2106,18 +2077,6 @@
 </file>
 
 <file path=customXml/itemProps1.xml><?xml version="1.0" encoding="utf-8"?>
-<ds:datastoreItem xmlns:ds="http://schemas.openxmlformats.org/officeDocument/2006/customXml" ds:itemID="{AA343475-5008-42F8-982D-496C4FC3E7D6}">
-  <ds:schemaRefs>
-    <ds:schemaRef ds:uri="http://schemas.microsoft.com/office/2006/metadata/properties"/>
-    <ds:schemaRef ds:uri="http://schemas.microsoft.com/office/infopath/2007/PartnerControls"/>
-    <ds:schemaRef ds:uri="http://schemas.microsoft.com/sharepoint/v3"/>
-    <ds:schemaRef ds:uri="7ac25642-bc50-40b5-aee4-3aad54522c8e"/>
-    <ds:schemaRef ds:uri="cccaf3ac-2de9-44d4-aa31-54302fceb5f7"/>
-  </ds:schemaRefs>
-</ds:datastoreItem>
-</file>
-
-<file path=customXml/itemProps2.xml><?xml version="1.0" encoding="utf-8"?>
 <ds:datastoreItem xmlns:ds="http://schemas.openxmlformats.org/officeDocument/2006/customXml" ds:itemID="{D642DA68-CD6C-49A0-B18E-23C5608910F2}">
   <ds:schemaRefs>
     <ds:schemaRef ds:uri="http://schemas.microsoft.com/sharepoint/v3/contenttype/forms"/>
@@ -2125,24 +2084,17 @@
 </ds:datastoreItem>
 </file>
 
-<file path=customXml/itemProps3.xml><?xml version="1.0" encoding="utf-8"?>
-<ds:datastoreItem xmlns:ds="http://schemas.openxmlformats.org/officeDocument/2006/customXml" ds:itemID="{E5E6D175-DC3E-40A9-B00A-ECB0533EF9DD}">
+<file path=customXml/itemProps2.xml><?xml version="1.0" encoding="utf-8"?>
+<ds:datastoreItem xmlns:ds="http://schemas.openxmlformats.org/officeDocument/2006/customXml" ds:itemID="{AA343475-5008-42F8-982D-496C4FC3E7D6}">
   <ds:schemaRefs>
-    <ds:schemaRef ds:uri="http://schemas.microsoft.com/office/2006/metadata/contentType"/>
-    <ds:schemaRef ds:uri="http://schemas.microsoft.com/office/2006/metadata/properties/metaAttributes"/>
-    <ds:schemaRef ds:uri="http://www.w3.org/2001/XMLSchema"/>
     <ds:schemaRef ds:uri="http://schemas.microsoft.com/office/2006/metadata/properties"/>
+    <ds:schemaRef ds:uri="http://schemas.microsoft.com/office/infopath/2007/PartnerControls"/>
+    <ds:schemaRef ds:uri="5e67cd05-db79-4376-acf2-fd97aaab4b32"/>
     <ds:schemaRef ds:uri="http://schemas.microsoft.com/sharepoint/v3"/>
-    <ds:schemaRef ds:uri="22284d95-5a94-4052-8e65-be8da71d5f72"/>
-    <ds:schemaRef ds:uri="7ac25642-bc50-40b5-aee4-3aad54522c8e"/>
-    <ds:schemaRef ds:uri="51bfcd92-eb3e-40f4-8778-2bbfb88a890b"/>
-    <ds:schemaRef ds:uri="cccaf3ac-2de9-44d4-aa31-54302fceb5f7"/>
-    <ds:schemaRef ds:uri="http://schemas.microsoft.com/office/2006/documentManagement/types"/>
-    <ds:schemaRef ds:uri="http://schemas.microsoft.com/office/infopath/2007/PartnerControls"/>
-    <ds:schemaRef ds:uri="http://schemas.openxmlformats.org/package/2006/metadata/core-properties"/>
-    <ds:schemaRef ds:uri="http://purl.org/dc/elements/1.1/"/>
-    <ds:schemaRef ds:uri="http://purl.org/dc/terms/"/>
-    <ds:schemaRef ds:uri="http://schemas.microsoft.com/internal/obd"/>
   </ds:schemaRefs>
 </ds:datastoreItem>
+</file>
+
+<file path=customXml/itemProps3.xml><?xml version="1.0" encoding="utf-8"?>
+<ds:datastoreItem xmlns:ds="http://schemas.openxmlformats.org/officeDocument/2006/customXml" ds:itemID="{C142C95B-69E5-4D26-8402-4C0DDDBF2B9D}"/>
 </file>
</xml_diff>